<commit_message>
docs(rapport): clean placeholder sections in PFE report
</commit_message>
<xml_diff>
--- a/Pres+report/Raport_PFE.docx
+++ b/Pres+report/Raport_PFE.docx
@@ -2257,7 +2257,7 @@
         <w:t>BounharAbdelaziz/Morocco-Darija-STT-large</w:t>
       </w:r>
       <w:r>
-        <w:t>, seul à préserver simultanément les quantités numériques et les emprunts techniques français dont dépend l’intégralité du schéma métier. Son coût ( 7,7 s et 4 Go de mémoire graphique ) lui vaut en production la position de repli au sein d’une chaîne de trois moteurs, arbitrage explicité au §4.3.5. La chaîne complète, de la note vocale à la réponse de confirmation, est opérationnelle depuis la phase de développement du cœur IA, une phase avant la date prévue. [À COMPLÉTER : résultats chiffrés du pilote en conditions réelles]</w:t>
+        <w:t>, seul à préserver simultanément les quantités numériques et les emprunts techniques français dont dépend l’intégralité du schéma métier. Son coût ( 7,7 s et 4 Go de mémoire graphique ) lui vaut en production la position de repli au sein d’une chaîne de trois moteurs, arbitrage explicité au §4.3.5. La chaîne complète, de la note vocale à la réponse de confirmation, est opérationnelle depuis la phase de développement du cœur IA, une phase avant la date prévue.</w:t>
       </w:r>
     </w:p>
     <w:p>
@@ -2342,7 +2342,7 @@
         <w:t>BounharAbdelaziz/Morocco-Darija-STT-large</w:t>
       </w:r>
       <w:r>
-        <w:t>, the only one preserving both numeric quantities and the French technical loanwords on which the entire business schema depends. Its cost ( 7.7 s and 4 GB of GPU memory ) places it in production as the fallback within a three-engine chain, a trade-off set out in §4.3.5. The full chain, from voice note to confirmation reply, has been operational since the core-AI phase, one phase ahead of the plan. [TO BE COMPLETED: field-pilot figures]</w:t>
+        <w:t>, the only one preserving both numeric quantities and the French technical loanwords on which the entire business schema depends. Its cost ( 7.7 s and 4 GB of GPU memory ) places it in production as the fallback within a three-engine chain, a trade-off set out in §4.3.5. The full chain, from voice note to confirmation reply, has been operational since the core-AI phase, one phase ahead of the plan.</w:t>
       </w:r>
     </w:p>
     <w:p>
@@ -40930,13 +40930,6 @@
       <w:pPr>
         <w:pStyle w:val="FirstParagraph"/>
       </w:pPr>
-      <w:r>
-        <w:rPr>
-          <w:i/>
-          <w:iCs/>
-        </w:rPr>
-        <w:t>[À COMPLÉTER — mesure de la latence note vocale → ligne dans le journal, à relever sur le pilote. Les latences unitaires mesurées sont disponibles : transcription 1,53 s (Groq) à 7,7 s (moteur local), extraction non chronométrée séparément.]</w:t>
-      </w:r>
     </w:p>
     <w:p>
       <w:pPr>
@@ -40954,13 +40947,6 @@
       <w:pPr>
         <w:pStyle w:val="FirstParagraph"/>
       </w:pPr>
-      <w:r>
-        <w:rPr>
-          <w:i/>
-          <w:iCs/>
-        </w:rPr>
-        <w:t>[À COMPLÉTER — déploiement pilote, nombre de rapports traités, retours des techniciens et de l’encadrement, incidents observés.]</w:t>
-      </w:r>
     </w:p>
     <w:p>
       <w:pPr>
@@ -47030,13 +47016,6 @@
       <w:r>
         <w:t xml:space="preserve"> La chaîne complète est opérationnelle depuis la phase 3, avec un mécanisme de repli validé en conditions réelles. Le système compte 85 routes, 64 nœuds d’orchestration, 26 tables et 860 tests automatisés exécutables sans aucune clé d’API. </w:t>
       </w:r>
-      <w:r>
-        <w:rPr>
-          <w:i/>
-          <w:iCs/>
-        </w:rPr>
-        <w:t>[À COMPLÉTER : latence de bout en bout mesurée et bilan du pilote.]</w:t>
-      </w:r>
     </w:p>
     <w:p>
       <w:pPr>
@@ -47071,17 +47050,7 @@
         <w:t>la suite de tests ne parcourt jamais le réseau réel</w:t>
       </w:r>
       <w:r>
-        <w:t xml:space="preserve"> ; elle sécurise les régressions de logique, non les ruptures de contrat des fournisseurs, qui ont été la source de la majorité des défauts rencontrés. Enfin, </w:t>
-      </w:r>
-      <w:r>
-        <w:rPr>
-          <w:i/>
-          <w:iCs/>
-        </w:rPr>
-        <w:t>[À COMPLÉTER : bilan du pilote en conditions réelles]</w:t>
-      </w:r>
-      <w:r>
-        <w:t>.</w:t>
+        <w:t xml:space="preserve"> ; elle sécurise les régressions de logique, non les ruptures de contrat des fournisseurs, qui ont été la source de la majorité des défauts rencontrés.</w:t>
       </w:r>
     </w:p>
     <w:p>

</xml_diff>

<commit_message>
docs(rapport): remove empty placeholder sections 4.6.4 and 4.6.5 (latence, pilote)
</commit_message>
<xml_diff>
--- a/Pres+report/Raport_PFE.docx
+++ b/Pres+report/Raport_PFE.docx
@@ -40914,40 +40914,7 @@
         </w:tc>
       </w:tr>
     </w:tbl>
-    <w:p>
-      <w:pPr>
-        <w:pStyle w:val="Heading3"/>
-      </w:pPr>
-      <w:bookmarkStart w:id="259" w:name="latence-de-bout-en-bout"/>
-      <w:bookmarkStart w:id="260" w:name="_Toc240316121"/>
-      <w:bookmarkEnd w:id="256"/>
-      <w:r>
-        <w:t>4.6.4 Latence de bout en bout</w:t>
-      </w:r>
-      <w:bookmarkEnd w:id="260"/>
-    </w:p>
-    <w:p>
-      <w:pPr>
-        <w:pStyle w:val="FirstParagraph"/>
-      </w:pPr>
-    </w:p>
-    <w:p>
-      <w:pPr>
-        <w:pStyle w:val="Heading3"/>
-      </w:pPr>
-      <w:bookmarkStart w:id="261" w:name="pilote"/>
-      <w:bookmarkStart w:id="262" w:name="_Toc240316122"/>
-      <w:bookmarkEnd w:id="259"/>
-      <w:r>
-        <w:t>4.6.5 Pilote</w:t>
-      </w:r>
-      <w:bookmarkEnd w:id="262"/>
-    </w:p>
-    <w:p>
-      <w:pPr>
-        <w:pStyle w:val="FirstParagraph"/>
-      </w:pPr>
-    </w:p>
+    <w:bookmarkEnd w:id="256"/>
     <w:p>
       <w:pPr>
         <w:pStyle w:val="Heading2"/>

</xml_diff>